<commit_message>
Publish Zaobian AI product portfolio update
</commit_message>
<xml_diff>
--- a/portfolio/zaobian-prd-v1.3.docx
+++ b/portfolio/zaobian-prd-v1.3.docx
@@ -17,12 +17,12 @@
     </w:p>
     <w:p>
       <w:r>
-        <w:t>更新日期：2026-09-05</w:t>
+        <w:t>更新日期：2026-09-10</w:t>
       </w:r>
     </w:p>
     <w:p>
       <w:r>
-        <w:t>状态：固定菜单 MVP 需求与公开作品集交付基准；工程验收、真人验收和线上效果分别记录。</w:t>
+        <w:t>状态：公开体验版需求与作品集交付基准；账号、AI 候选排序与实时语音按 Beta 能力管理，工程验收、真人验收和线上效果分别记录。</w:t>
       </w:r>
     </w:p>
     <w:p>
@@ -92,7 +92,7 @@
     </w:p>
     <w:p>
       <w:r>
-        <w:t>本版包含：渐进建档、本餐条件、完整套餐推荐、采购清单、开做前准备、固定菜单内语音指导、文本按钮兜底、饭后反馈与本餐记录，以及配套的评测、问题回流和基础监控。</w:t>
+        <w:t>本版包含：可跳过的邮箱建档、本餐条件、完整套餐推荐、采购清单、开做前准备、固定菜单内实时语音指导、文本按钮兜底、饭后反馈与本餐记录，以及配套的评测、问题回流和基础监控。推荐采用“确定性硬约束过滤 + 千问候选排序与解释”；模型失败时回退规则排序。</w:t>
       </w:r>
     </w:p>
     <w:p>
@@ -1292,6 +1292,79 @@
                 <w:sz w:val="18"/>
               </w:rPr>
               <w:t>P1</w:t>
+            </w:r>
+          </w:p>
+        </w:tc>
+      </w:tr>
+      <w:tr>
+        <w:trPr>
+          <w:cantSplit/>
+        </w:trPr>
+        <w:tc>
+          <w:tcPr>
+            <w:tcW w:type="dxa" w:w="2466"/>
+          </w:tcPr>
+          <w:p>
+            <w:pPr>
+              <w:spacing w:after="80" w:line="264" w:lineRule="auto"/>
+            </w:pPr>
+            <w:r>
+              <w:rPr>
+                <w:b w:val="0"/>
+                <w:sz w:val="18"/>
+              </w:rPr>
+              <w:t>F11</w:t>
+            </w:r>
+          </w:p>
+        </w:tc>
+        <w:tc>
+          <w:tcPr>
+            <w:tcW w:type="dxa" w:w="2466"/>
+          </w:tcPr>
+          <w:p>
+            <w:pPr>
+              <w:spacing w:after="80" w:line="264" w:lineRule="auto"/>
+            </w:pPr>
+            <w:r>
+              <w:rPr>
+                <w:b w:val="0"/>
+                <w:sz w:val="18"/>
+              </w:rPr>
+              <w:t>我希望登录后保存自己的饮食需求</w:t>
+            </w:r>
+          </w:p>
+        </w:tc>
+        <w:tc>
+          <w:tcPr>
+            <w:tcW w:type="dxa" w:w="2466"/>
+          </w:tcPr>
+          <w:p>
+            <w:pPr>
+              <w:spacing w:after="80" w:line="264" w:lineRule="auto"/>
+            </w:pPr>
+            <w:r>
+              <w:rPr>
+                <w:b w:val="0"/>
+                <w:sz w:val="18"/>
+              </w:rPr>
+              <w:t>邮箱验证码登录；账号与游客数据隔离；只同步明确确认的长期需求</w:t>
+            </w:r>
+          </w:p>
+        </w:tc>
+        <w:tc>
+          <w:tcPr>
+            <w:tcW w:type="dxa" w:w="2466"/>
+          </w:tcPr>
+          <w:p>
+            <w:pPr>
+              <w:spacing w:after="80" w:line="264" w:lineRule="auto"/>
+            </w:pPr>
+            <w:r>
+              <w:rPr>
+                <w:b w:val="0"/>
+                <w:sz w:val="18"/>
+              </w:rPr>
+              <w:t>P1，Beta</w:t>
             </w:r>
           </w:p>
         </w:tc>

</xml_diff>